<commit_message>
Updated documentation. Final version for submission.
</commit_message>
<xml_diff>
--- a/docs/documentation.docx
+++ b/docs/documentation.docx
@@ -542,7 +542,7 @@
         <w:rPr>
           <w:rtl w:val="0"/>
         </w:rPr>
-        <w:t xml:space="preserve">Session пази изображенията, трансформациите, undo/redo историята и флаг дали има незапазена работа. При add на ново изображение се пази индексът на първата трансформация, която важи за него. Така старите трансформации не се прилагат върху изображения, добавени по-късно.</w:t>
+        <w:t xml:space="preserve">Session пази изображенията, трансформациите, undo/redo историята и флаг дали има незапазена работа. При add на ново изображение се пази индексът на първата трансформация, която важи за него. Така старите трансформации не се прилагат върху изображения, добавени по-късно. Има притеснения за чупливост на функционалността, поради употребата на забазен индекс, но това не е било преразглеждано до завършването на кода и не показало грешки при тестване.</w:t>
       </w:r>
     </w:p>
     <w:p>
@@ -644,7 +644,7 @@
         <w:rPr>
           <w:rtl w:val="0"/>
         </w:rPr>
-        <w:t xml:space="preserve">Проектът реализира собствено четене и запис на изображения. Не се използва външна библиотека за обработка на картини. Поддържаните формати са Netpbm форматите PBM, PGM и PPM, както и основен BMP формат. Кодът за всеки формат е отделен в собствен клас, за да бъде по-четим при импорт и експорт.</w:t>
+        <w:t xml:space="preserve">Проектът реализира собствено четене и запис на изображения. Поддържаните формати са Netpbm форматите PBM, PGM и PPM, както и основен BMP формат. Кодът за всеки формат е отделен в собствен клас, за да бъде по-четим при импорт и експорт.</w:t>
       </w:r>
     </w:p>
     <w:p>
@@ -1023,7 +1023,7 @@
         <w:rPr>
           <w:rtl w:val="0"/>
         </w:rPr>
-        <w:t xml:space="preserve">Session оптимизира част от неутралните последователности. Две поредни negative операции се премахват. Две еднакви reflection операции също се премахват. rotate left последвано от rotate right се премахва. Четири поредни ротации в една и съща посока също се премахват.</w:t>
+        <w:t xml:space="preserve">Session оптимизира част от неутралните последователности. Преминава се през матрица на състоянията и трансформациите, чрез която се разбира кои ще са финално изпълнените трансформации. По този начин се пропуска нуждата от задължително изпълнение на всяка трансформация в списъка.</w:t>
       </w:r>
     </w:p>
     <w:p>
@@ -1892,6 +1892,11 @@
         </w:rPr>
         <w:t xml:space="preserve">Този модел е прост и обясним. В бъдеща версия може да се използват smart pointers, но за учебната цел raw pointer моделът е приемлив, защото собствеността е ясна и има деструктори.</w:t>
       </w:r>
+      <w:r>
+        <w:rPr>
+          <w:rtl w:val="0"/>
+        </w:rPr>
+      </w:r>
     </w:p>
     <w:p>
       <w:pPr>
@@ -1908,151 +1913,18 @@
           <w:szCs w:val="28"/>
           <w:rtl w:val="0"/>
         </w:rPr>
-        <w:t xml:space="preserve">10. Тестване</w:t>
-      </w:r>
-      <w:r>
-        <w:rPr>
-          <w:rtl w:val="0"/>
-        </w:rPr>
-      </w:r>
-    </w:p>
-    <w:p>
-      <w:pPr>
-        <w:rPr/>
-      </w:pPr>
-      <w:r>
-        <w:rPr>
-          <w:rtl w:val="0"/>
-        </w:rPr>
-        <w:t xml:space="preserve">Проектът е тестван с CMake build и с няколко функционални smoke сценария. Проверено е, че проектът се конфигурира и компилира успешно.</w:t>
-      </w:r>
-    </w:p>
-    <w:p>
-      <w:pPr>
-        <w:spacing w:after="20" w:lineRule="auto"/>
-        <w:ind w:left="504" w:firstLine="0"/>
-        <w:rPr/>
-      </w:pPr>
-      <w:r>
-        <w:rPr>
-          <w:rFonts w:ascii="Courier New" w:cs="Courier New" w:eastAsia="Courier New" w:hAnsi="Courier New"/>
-          <w:sz w:val="20"/>
-          <w:szCs w:val="20"/>
-          <w:rtl w:val="0"/>
-        </w:rPr>
-        <w:t xml:space="preserve">cmake -S . -B build</w:t>
-      </w:r>
-      <w:r>
-        <w:rPr>
-          <w:rtl w:val="0"/>
-        </w:rPr>
-      </w:r>
-    </w:p>
-    <w:p>
-      <w:pPr>
-        <w:spacing w:after="20" w:lineRule="auto"/>
-        <w:ind w:left="504" w:firstLine="0"/>
-        <w:rPr/>
-      </w:pPr>
-      <w:r>
-        <w:rPr>
-          <w:rFonts w:ascii="Courier New" w:cs="Courier New" w:eastAsia="Courier New" w:hAnsi="Courier New"/>
-          <w:sz w:val="20"/>
-          <w:szCs w:val="20"/>
-          <w:rtl w:val="0"/>
-        </w:rPr>
-        <w:t xml:space="preserve">cmake --build build</w:t>
-      </w:r>
-      <w:r>
-        <w:rPr>
-          <w:rtl w:val="0"/>
-        </w:rPr>
-      </w:r>
-    </w:p>
-    <w:p>
-      <w:pPr>
-        <w:rPr/>
-      </w:pPr>
-      <w:r>
-        <w:rPr>
-          <w:rtl w:val="0"/>
-        </w:rPr>
-        <w:t xml:space="preserve">Проверени са load на PPM, PGM и BMP; list session; grayscale; rotate; flip; undo; redo; save; add на PBM; paste от едно изображение в друго; switch и close при повече от една сесия. Проверено е също, че програмата създава timestamp файлове при save.</w:t>
-      </w:r>
-    </w:p>
-    <w:p>
-      <w:pPr>
-        <w:rPr/>
-      </w:pPr>
-      <w:r>
-        <w:rPr>
-          <w:rtl w:val="0"/>
-        </w:rPr>
-        <w:t xml:space="preserve">В директория examples има малки примерни файлове: color.ppm, gray.pgm, mask.pbm и basic.bmp. Те са малки, за да могат да се отворят и разгледат лесно. Те са подходящи за демонстрация на защитата.</w:t>
-      </w:r>
-    </w:p>
-    <w:p>
-      <w:pPr>
-        <w:rPr/>
-      </w:pPr>
-      <w:r>
-        <w:rPr>
-          <w:rtl w:val="0"/>
-        </w:rPr>
-        <w:t xml:space="preserve">Пуснато е и търсене за маркери за недовършена работа. Такива маркери не остават в проекта.</w:t>
-      </w:r>
-    </w:p>
-    <w:p>
-      <w:pPr>
-        <w:spacing w:after="120" w:before="200" w:lineRule="auto"/>
-        <w:ind w:firstLine="0"/>
-        <w:rPr/>
-      </w:pPr>
-      <w:r>
-        <w:rPr>
-          <w:rFonts w:ascii="Times New Roman" w:cs="Times New Roman" w:eastAsia="Times New Roman" w:hAnsi="Times New Roman"/>
+        <w:t xml:space="preserve">1</w:t>
+      </w:r>
+      <w:r>
+        <w:rPr>
           <w:b w:val="1"/>
           <w:bCs w:val="1"/>
           <w:sz w:val="28"/>
           <w:szCs w:val="28"/>
           <w:rtl w:val="0"/>
         </w:rPr>
-        <w:t xml:space="preserve">11. Ограничения</w:t>
-      </w:r>
-      <w:r>
-        <w:rPr>
-          <w:rtl w:val="0"/>
-        </w:rPr>
-      </w:r>
-    </w:p>
-    <w:p>
-      <w:pPr>
-        <w:rPr/>
-      </w:pPr>
-      <w:r>
-        <w:rPr>
-          <w:rtl w:val="0"/>
-        </w:rPr>
-        <w:t xml:space="preserve">Командният parser разделя по whitespace. Това означава, че пътища с интервали не са удобни. Netpbm файловете се нормализират към вътрешни 8-bit RGB пиксели. BMP поддръжката е ограничена до uncompressed 24-bit и 32-bit файлове при четене и 24-bit при запис.</w:t>
-      </w:r>
-    </w:p>
-    <w:p>
-      <w:pPr>
-        <w:rPr/>
-      </w:pPr>
-      <w:r>
-        <w:rPr>
-          <w:rtl w:val="0"/>
-        </w:rPr>
-        <w:t xml:space="preserve">Програмата няма графичен интерфейс. Това е нормално, защото условието изисква конзолен редактор. Няма и отделна help команда, но командите са описани в README и в тази документация.</w:t>
-      </w:r>
-    </w:p>
-    <w:p>
-      <w:pPr>
-        <w:spacing w:after="120" w:before="200" w:lineRule="auto"/>
-        <w:ind w:firstLine="0"/>
-        <w:rPr/>
-      </w:pPr>
+        <w:t xml:space="preserve">0</w:t>
+      </w:r>
       <w:r>
         <w:rPr>
           <w:rFonts w:ascii="Times New Roman" w:cs="Times New Roman" w:eastAsia="Times New Roman" w:hAnsi="Times New Roman"/>
@@ -2062,67 +1934,53 @@
           <w:szCs w:val="28"/>
           <w:rtl w:val="0"/>
         </w:rPr>
-        <w:t xml:space="preserve">12. Идеи за бъдещи подобрения</w:t>
-      </w:r>
-      <w:r>
-        <w:rPr>
-          <w:rtl w:val="0"/>
-        </w:rPr>
-      </w:r>
-    </w:p>
-    <w:p>
-      <w:pPr>
-        <w:rPr/>
-      </w:pPr>
-      <w:r>
-        <w:rPr>
-          <w:rtl w:val="0"/>
-        </w:rPr>
-        <w:t xml:space="preserve">В бъдеще може да се добави parser за пътища с кавички, за да се работи с файлове, чиито имена съдържат интервали. Може да се добави help команда, която да извежда всички команди и кратки примери.</w:t>
-      </w:r>
-    </w:p>
-    <w:p>
-      <w:pPr>
-        <w:rPr/>
-      </w:pPr>
-      <w:r>
-        <w:rPr>
-          <w:rtl w:val="0"/>
-        </w:rPr>
-        <w:t xml:space="preserve">Може да се добави save as команда и възможност за запис в различен формат от оригиналния. Също така може да се добавят още трансформации като crop, resize, brightness и contrast.</w:t>
-      </w:r>
-    </w:p>
-    <w:p>
-      <w:pPr>
-        <w:rPr/>
-      </w:pPr>
-      <w:r>
-        <w:rPr>
-          <w:rtl w:val="0"/>
-        </w:rPr>
-        <w:t xml:space="preserve">Добро бъдещо подобрение са автоматизирани unit тестове. В момента има smoke тестове, но unit тестове за Image, Session и ActionReceiver биха направили проекта по-сигурен при промени.</w:t>
-      </w:r>
-    </w:p>
-    <w:p>
-      <w:pPr>
-        <w:rPr/>
-      </w:pPr>
-      <w:r>
-        <w:rPr>
-          <w:rtl w:val="0"/>
-        </w:rPr>
-      </w:r>
-    </w:p>
-    <w:p>
-      <w:pPr>
+        <w:t xml:space="preserve">. Ограничения</w:t>
+      </w:r>
+      <w:r>
+        <w:rPr>
+          <w:rtl w:val="0"/>
+        </w:rPr>
+      </w:r>
+    </w:p>
+    <w:p>
+      <w:pPr>
+        <w:rPr/>
+      </w:pPr>
+      <w:r>
+        <w:rPr>
+          <w:rtl w:val="0"/>
+        </w:rPr>
+        <w:t xml:space="preserve">Командният parser разделя по whitespace. Това означава, че пътища с интервали не са удобни. Netpbm файловете се нормализират към вътрешни 8-bit RGB пиксели. BMP поддръжката е ограничена до uncompressed 24-bit и 32-bit файлове при четене и 24-bit при запис.</w:t>
+      </w:r>
+    </w:p>
+    <w:p>
+      <w:pPr>
+        <w:rPr/>
+      </w:pPr>
+      <w:r>
+        <w:rPr>
+          <w:rtl w:val="0"/>
+        </w:rPr>
+        <w:t xml:space="preserve">Програмата няма графичен интерфейс. Това е нормално, защото условието изисква конзолен редактор. Няма и отделна help команда, но командите са описани в README и в тази документация.</w:t>
+      </w:r>
+    </w:p>
+    <w:p>
+      <w:pPr>
+        <w:spacing w:after="120" w:before="200" w:lineRule="auto"/>
         <w:ind w:firstLine="0"/>
-        <w:rPr>
+        <w:rPr/>
+      </w:pPr>
+      <w:r>
+        <w:rPr>
+          <w:rFonts w:ascii="Times New Roman" w:cs="Times New Roman" w:eastAsia="Times New Roman" w:hAnsi="Times New Roman"/>
           <w:b w:val="1"/>
           <w:bCs w:val="1"/>
           <w:sz w:val="28"/>
           <w:szCs w:val="28"/>
-        </w:rPr>
-      </w:pPr>
+          <w:rtl w:val="0"/>
+        </w:rPr>
+        <w:t xml:space="preserve">1</w:t>
+      </w:r>
       <w:r>
         <w:rPr>
           <w:b w:val="1"/>
@@ -2131,6 +1989,86 @@
           <w:szCs w:val="28"/>
           <w:rtl w:val="0"/>
         </w:rPr>
+        <w:t xml:space="preserve">1</w:t>
+      </w:r>
+      <w:r>
+        <w:rPr>
+          <w:rFonts w:ascii="Times New Roman" w:cs="Times New Roman" w:eastAsia="Times New Roman" w:hAnsi="Times New Roman"/>
+          <w:b w:val="1"/>
+          <w:bCs w:val="1"/>
+          <w:sz w:val="28"/>
+          <w:szCs w:val="28"/>
+          <w:rtl w:val="0"/>
+        </w:rPr>
+        <w:t xml:space="preserve">. Идеи за бъдещи подобрения</w:t>
+      </w:r>
+      <w:r>
+        <w:rPr>
+          <w:rtl w:val="0"/>
+        </w:rPr>
+      </w:r>
+    </w:p>
+    <w:p>
+      <w:pPr>
+        <w:rPr/>
+      </w:pPr>
+      <w:r>
+        <w:rPr>
+          <w:rtl w:val="0"/>
+        </w:rPr>
+        <w:t xml:space="preserve">В бъдеще може да се добави parser за пътища с кавички, за да се работи с файлове, чиито имена съдържат интервали. Може да се добави help команда, която да извежда всички команди и кратки примери.</w:t>
+      </w:r>
+    </w:p>
+    <w:p>
+      <w:pPr>
+        <w:rPr/>
+      </w:pPr>
+      <w:r>
+        <w:rPr>
+          <w:rtl w:val="0"/>
+        </w:rPr>
+        <w:t xml:space="preserve">Може да се добави save as команда и възможност за запис в различен формат от оригиналния. Също така може да се добавят още трансформации като crop, resize, brightness и contrast.</w:t>
+      </w:r>
+    </w:p>
+    <w:p>
+      <w:pPr>
+        <w:rPr/>
+      </w:pPr>
+      <w:r>
+        <w:rPr>
+          <w:rtl w:val="0"/>
+        </w:rPr>
+        <w:t xml:space="preserve">Добро бъдещо подобрение са автоматизирани unit тестове. В момента има smoke тестове, но unit тестове за Image, Session и ActionReceiver биха направили проекта по-сигурен при промени.</w:t>
+      </w:r>
+    </w:p>
+    <w:p>
+      <w:pPr>
+        <w:rPr/>
+      </w:pPr>
+      <w:r>
+        <w:rPr>
+          <w:rtl w:val="0"/>
+        </w:rPr>
+      </w:r>
+    </w:p>
+    <w:p>
+      <w:pPr>
+        <w:ind w:firstLine="0"/>
+        <w:rPr>
+          <w:b w:val="1"/>
+          <w:bCs w:val="1"/>
+          <w:sz w:val="28"/>
+          <w:szCs w:val="28"/>
+        </w:rPr>
+      </w:pPr>
+      <w:r>
+        <w:rPr>
+          <w:b w:val="1"/>
+          <w:bCs w:val="1"/>
+          <w:sz w:val="28"/>
+          <w:szCs w:val="28"/>
+          <w:rtl w:val="0"/>
+        </w:rPr>
         <w:t xml:space="preserve">13. Последни уточнения</w:t>
       </w:r>
     </w:p>
@@ -2143,7 +2081,7 @@
         <w:rPr>
           <w:rtl w:val="0"/>
         </w:rPr>
-        <w:t xml:space="preserve">За разработката на четенето и записването във файлове е използвана помощта на изкуствен интелект, специфично Gemini, както и за съкращаване на работата върху документацията.</w:t>
+        <w:t xml:space="preserve">За разработката на четенето и записването във файлове е използвана помощта на изкуствен интелект, специфично Gemini, както и за съкращаване на работата върху документацията. Изкуствен интелект е употребен и за генерирането на примерни изображения с цел тестване на проекта. Не са правени Unit test-ове, главният процес на тестове на кода е преминаване през различни сценарии, като са изпълнени няколко частични smoke test-а.</w:t>
       </w:r>
     </w:p>
     <w:sectPr>

</xml_diff>